<commit_message>
Added additional information and context; docs: add registration channels, glossary and constitution inputs
</commit_message>
<xml_diff>
--- a/docs/brief/club-membership-brief.docx
+++ b/docs/brief/club-membership-brief.docx
@@ -2,14 +2,15 @@
 <file path=word/document.xml><?xml version="1.0" encoding="utf-8"?>
 <w:document xmlns:w="http://schemas.openxmlformats.org/wordprocessingml/2006/main" xmlns:m="http://schemas.openxmlformats.org/officeDocument/2006/math" xmlns:r="http://schemas.openxmlformats.org/officeDocument/2006/relationships" xmlns:o="urn:schemas-microsoft-com:office:office" xmlns:v="urn:schemas-microsoft-com:vml" xmlns:w10="urn:schemas-microsoft-com:office:word" xmlns:a="http://schemas.openxmlformats.org/drawingml/2006/main" xmlns:pic="http://schemas.openxmlformats.org/drawingml/2006/picture" xmlns:wp="http://schemas.openxmlformats.org/drawingml/2006/wordprocessingDrawing">
   <w:body>
-    <w:bookmarkStart w:id="22" w:name="X4bbf7cfb321a04556c05f8cff5b5a65e4ed2874"/>
     <w:p>
       <w:pPr>
         <w:pStyle w:val="Heading1"/>
       </w:pPr>
+      <w:bookmarkStart w:id="20" w:name="X4bbf7cfb321a04556c05f8cff5b5a65e4ed2874"/>
       <w:r>
         <w:t xml:space="preserve">The Calligraphy Art Club Membership Management System</w:t>
       </w:r>
+      <w:bookmarkEnd w:id="20"/>
     </w:p>
     <w:p>
       <w:pPr>
@@ -49,14 +50,15 @@
         <w:t xml:space="preserve">”</w:t>
       </w:r>
     </w:p>
-    <w:bookmarkStart w:id="20" w:name="current-pain-points"/>
     <w:p>
       <w:pPr>
         <w:pStyle w:val="Heading2"/>
       </w:pPr>
-      <w:r>
-        <w:t xml:space="preserve">Current Pain Points</w:t>
-      </w:r>
+      <w:bookmarkStart w:id="21" w:name="existing-tools-and-registration-channels"/>
+      <w:r>
+        <w:t xml:space="preserve">Existing Tools and Registration Channels</w:t>
+      </w:r>
+      <w:bookmarkEnd w:id="21"/>
     </w:p>
     <w:p>
       <w:pPr>
@@ -68,16 +70,15 @@
       </w:pPr>
       <w:r>
         <w:rPr>
-          <w:bCs/>
           <w:b/>
         </w:rPr>
-        <w:t xml:space="preserve">Outdated member list:</w:t>
+        <w:t xml:space="preserve">Club website with an online registration form:</w:t>
       </w:r>
       <w:r>
         <w:t xml:space="preserve"> </w:t>
       </w:r>
       <w:r>
-        <w:t xml:space="preserve">Member information is stored in a Google Sheet, but it is not kept up to date. The list is stale — many people no longer take part in Club activities — so the current membership list and each member’s payment status cannot be confirmed.</w:t>
+        <w:t xml:space="preserve">The Club has a website with a link to a Google Form. A new member can register by clicking the link and filling in the form.</w:t>
       </w:r>
     </w:p>
     <w:p>
@@ -90,16 +91,15 @@
       </w:pPr>
       <w:r>
         <w:rPr>
-          <w:bCs/>
           <w:b/>
         </w:rPr>
-        <w:t xml:space="preserve">Paper-based registration:</w:t>
+        <w:t xml:space="preserve">Google Sheet as the member list:</w:t>
       </w:r>
       <w:r>
         <w:t xml:space="preserve"> </w:t>
       </w:r>
       <w:r>
-        <w:t xml:space="preserve">Some new members register on a sheet of paper, with no consistent data entry. For the past two years, Alex has recorded everything by hand.</w:t>
+        <w:t xml:space="preserve">Each Google Form submission automatically creates a new member record in the existing Google Sheet.</w:t>
       </w:r>
     </w:p>
     <w:p>
@@ -112,16 +112,15 @@
       </w:pPr>
       <w:r>
         <w:rPr>
-          <w:bCs/>
           <w:b/>
         </w:rPr>
-        <w:t xml:space="preserve">Difficult payment reconciliation:</w:t>
+        <w:t xml:space="preserve">Payments recorded separately:</w:t>
       </w:r>
       <w:r>
         <w:t xml:space="preserve"> </w:t>
       </w:r>
       <w:r>
-        <w:t xml:space="preserve">Several payment methods are in use at the same time — cash, e-Transfer, credit card, and others. The treasurer has to verify each payment one by one to confirm the money was received, and cash payments require extra coordination.</w:t>
+        <w:t xml:space="preserve">The membership fee payment is not recorded in the Google Sheet (or anywhere linked to the member record), so there is no single place showing both who registered and who has paid.</w:t>
       </w:r>
     </w:p>
     <w:p>
@@ -134,79 +133,26 @@
       </w:pPr>
       <w:r>
         <w:rPr>
-          <w:bCs/>
           <w:b/>
         </w:rPr>
-        <w:t xml:space="preserve">Fragmented communication:</w:t>
+        <w:t xml:space="preserve">Paper registration still in use:</w:t>
       </w:r>
       <w:r>
         <w:t xml:space="preserve"> </w:t>
       </w:r>
       <w:r>
-        <w:t xml:space="preserve">Members are contacted through mass emails and WeChat groups. There is no single master list — the email group list, the WeChat group list and the Google Sheet list are not in sync.</w:t>
-      </w:r>
-    </w:p>
-    <w:p>
-      <w:pPr>
-        <w:numPr>
-          <w:ilvl w:val="0"/>
-          <w:numId w:val="1001"/>
-        </w:numPr>
-        <w:pStyle w:val="Compact"/>
-      </w:pPr>
-      <w:r>
-        <w:rPr>
-          <w:bCs/>
-          <w:b/>
-        </w:rPr>
-        <w:t xml:space="preserve">No event records:</w:t>
-      </w:r>
-      <w:r>
-        <w:t xml:space="preserve"> </w:t>
-      </w:r>
-      <w:r>
-        <w:t xml:space="preserve">Every event has on-site registration, but there is no quick way to verify whether someone is a member or eligible for the member price.</w:t>
-      </w:r>
-    </w:p>
-    <w:p>
-      <w:pPr>
-        <w:numPr>
-          <w:ilvl w:val="0"/>
-          <w:numId w:val="1001"/>
-        </w:numPr>
-        <w:pStyle w:val="Compact"/>
-      </w:pPr>
-      <w:r>
-        <w:rPr>
-          <w:bCs/>
-          <w:b/>
-        </w:rPr>
-        <w:t xml:space="preserve">Unclear history:</w:t>
-      </w:r>
-      <w:r>
-        <w:t xml:space="preserve"> </w:t>
-      </w:r>
-      <w:r>
-        <w:t xml:space="preserve">No one can say how many members the Club has had in the past, or how many it has now.</w:t>
-      </w:r>
-    </w:p>
-    <w:bookmarkEnd w:id="20"/>
-    <w:bookmarkStart w:id="21" w:name="goals"/>
+        <w:t xml:space="preserve">Alongside the online form, some new members still register on paper (see below).</w:t>
+      </w:r>
+    </w:p>
     <w:p>
       <w:pPr>
         <w:pStyle w:val="Heading2"/>
       </w:pPr>
-      <w:r>
-        <w:t xml:space="preserve">Goals</w:t>
-      </w:r>
-    </w:p>
-    <w:p>
-      <w:pPr>
-        <w:pStyle w:val="FirstParagraph"/>
-      </w:pPr>
-      <w:r>
-        <w:t xml:space="preserve">Build a membership management system. Once the system is live, the Club should be able to look up, at any time:</w:t>
-      </w:r>
+      <w:bookmarkStart w:id="22" w:name="current-pain-points"/>
+      <w:r>
+        <w:t xml:space="preserve">Current Pain Points</w:t>
+      </w:r>
+      <w:bookmarkEnd w:id="22"/>
     </w:p>
     <w:p>
       <w:pPr>
@@ -217,7 +163,16 @@
         <w:pStyle w:val="Compact"/>
       </w:pPr>
       <w:r>
-        <w:t xml:space="preserve">How many members it has had in total historically, and how many active (paid-up) members it has currently / in the current year</w:t>
+        <w:rPr>
+          <w:b/>
+        </w:rPr>
+        <w:t xml:space="preserve">Outdated member list:</w:t>
+      </w:r>
+      <w:r>
+        <w:t xml:space="preserve"> </w:t>
+      </w:r>
+      <w:r>
+        <w:t xml:space="preserve">Member information is stored in a Google Sheet, but it is not kept up to date. The list is stale — many people no longer take part in Club activities — so the current membership list and each member’s payment status cannot be confirmed.</w:t>
       </w:r>
     </w:p>
     <w:p>
@@ -229,7 +184,16 @@
         <w:pStyle w:val="Compact"/>
       </w:pPr>
       <w:r>
-        <w:t xml:space="preserve">Who has paid this year, through which payment method, and whether the treasurer has confirmed the funds were received</w:t>
+        <w:rPr>
+          <w:b/>
+        </w:rPr>
+        <w:t xml:space="preserve">Paper-based registration:</w:t>
+      </w:r>
+      <w:r>
+        <w:t xml:space="preserve"> </w:t>
+      </w:r>
+      <w:r>
+        <w:t xml:space="preserve">Despite the online form, some new members register on a sheet of paper, and these registrations are not consistently entered into the Google Sheet. For the past two years, Alex has recorded everything by hand.</w:t>
       </w:r>
     </w:p>
     <w:p>
@@ -241,7 +205,16 @@
         <w:pStyle w:val="Compact"/>
       </w:pPr>
       <w:r>
-        <w:t xml:space="preserve">Who attended each Club event, and how much was collected at member vs. non-member rates</w:t>
+        <w:rPr>
+          <w:b/>
+        </w:rPr>
+        <w:t xml:space="preserve">Difficult payment reconciliation:</w:t>
+      </w:r>
+      <w:r>
+        <w:t xml:space="preserve"> </w:t>
+      </w:r>
+      <w:r>
+        <w:t xml:space="preserve">Payments are not linked to member records in the Google Sheet. Several payment methods are in use at the same time — cash, e-Transfer, credit card, and others. The treasurer has to verify each payment one by one to confirm the money was received, and cash payments require extra coordination.</w:t>
       </w:r>
     </w:p>
     <w:p>
@@ -253,14 +226,129 @@
         <w:pStyle w:val="Compact"/>
       </w:pPr>
       <w:r>
+        <w:rPr>
+          <w:b/>
+        </w:rPr>
+        <w:t xml:space="preserve">Fragmented communication:</w:t>
+      </w:r>
+      <w:r>
+        <w:t xml:space="preserve"> </w:t>
+      </w:r>
+      <w:r>
+        <w:t xml:space="preserve">Members are contacted through mass emails and WeChat groups. There is no single master list — the email group list, the WeChat group list and the Google Sheet list are not in sync.</w:t>
+      </w:r>
+    </w:p>
+    <w:p>
+      <w:pPr>
+        <w:numPr>
+          <w:ilvl w:val="0"/>
+          <w:numId w:val="1002"/>
+        </w:numPr>
+        <w:pStyle w:val="Compact"/>
+      </w:pPr>
+      <w:r>
+        <w:rPr>
+          <w:b/>
+        </w:rPr>
+        <w:t xml:space="preserve">No event records:</w:t>
+      </w:r>
+      <w:r>
+        <w:t xml:space="preserve"> </w:t>
+      </w:r>
+      <w:r>
+        <w:t xml:space="preserve">Every event has on-site registration, but there is no quick way to verify whether someone is a member or eligible for the member price.</w:t>
+      </w:r>
+    </w:p>
+    <w:p>
+      <w:pPr>
+        <w:numPr>
+          <w:ilvl w:val="0"/>
+          <w:numId w:val="1002"/>
+        </w:numPr>
+        <w:pStyle w:val="Compact"/>
+      </w:pPr>
+      <w:r>
+        <w:rPr>
+          <w:b/>
+        </w:rPr>
+        <w:t xml:space="preserve">Unclear history:</w:t>
+      </w:r>
+      <w:r>
+        <w:t xml:space="preserve"> </w:t>
+      </w:r>
+      <w:r>
+        <w:t xml:space="preserve">No one can say how many members the Club has had in the past, or how many it has now.</w:t>
+      </w:r>
+    </w:p>
+    <w:p>
+      <w:pPr>
+        <w:pStyle w:val="Heading2"/>
+      </w:pPr>
+      <w:bookmarkStart w:id="23" w:name="goals"/>
+      <w:r>
+        <w:t xml:space="preserve">Goals</w:t>
+      </w:r>
+      <w:bookmarkEnd w:id="23"/>
+    </w:p>
+    <w:p>
+      <w:pPr>
+        <w:pStyle w:val="FirstParagraph"/>
+      </w:pPr>
+      <w:r>
+        <w:t xml:space="preserve">Build a membership management system. Once the system is live, the Club should be able to look up, at any time:</w:t>
+      </w:r>
+    </w:p>
+    <w:p>
+      <w:pPr>
+        <w:numPr>
+          <w:ilvl w:val="0"/>
+          <w:numId w:val="1003"/>
+        </w:numPr>
+        <w:pStyle w:val="Compact"/>
+      </w:pPr>
+      <w:r>
+        <w:t xml:space="preserve">How many members it has had in total historically, and how many active (paid-up) members it has currently / in the current year</w:t>
+      </w:r>
+    </w:p>
+    <w:p>
+      <w:pPr>
+        <w:numPr>
+          <w:ilvl w:val="0"/>
+          <w:numId w:val="1003"/>
+        </w:numPr>
+        <w:pStyle w:val="Compact"/>
+      </w:pPr>
+      <w:r>
+        <w:t xml:space="preserve">Who has paid this year, through which payment method, and whether the treasurer has confirmed the funds were received</w:t>
+      </w:r>
+    </w:p>
+    <w:p>
+      <w:pPr>
+        <w:numPr>
+          <w:ilvl w:val="0"/>
+          <w:numId w:val="1003"/>
+        </w:numPr>
+        <w:pStyle w:val="Compact"/>
+      </w:pPr>
+      <w:r>
+        <w:t xml:space="preserve">Who attended each Club event, and how much was collected at member vs. non-member rates</w:t>
+      </w:r>
+    </w:p>
+    <w:p>
+      <w:pPr>
+        <w:numPr>
+          <w:ilvl w:val="0"/>
+          <w:numId w:val="1003"/>
+        </w:numPr>
+        <w:pStyle w:val="Compact"/>
+      </w:pPr>
+      <w:r>
         <w:t xml:space="preserve">Which members have birthdays this month, so the Club can send greetings or event invitations</w:t>
       </w:r>
     </w:p>
-    <w:bookmarkEnd w:id="21"/>
-    <w:bookmarkEnd w:id="22"/>
     <w:sectPr>
-      <w:pgSz w:h="15840" w:w="12240"/>
-      <w:pgMar w:bottom="1440" w:footer="708" w:gutter="0" w:header="708" w:left="1440" w:right="1440" w:top="1440"/>
+      <w:pgSz w:w="12240" w:h="15840"/>
+      <w:pgMar w:top="1440" w:right="1440" w:bottom="1440" w:left="1440" w:header="708" w:footer="708" w:gutter="0"/>
       <w:cols w:space="708"/>
       <w:docGrid w:linePitch="360"/>
     </w:sectPr>
@@ -294,14 +382,17 @@
 <file path=word/numbering.xml><?xml version="1.0" encoding="utf-8"?>
 <w:numbering xmlns:w="http://schemas.openxmlformats.org/wordprocessingml/2006/main">
   <w:abstractNum w:abstractNumId="990">
-    <w:nsid w:val="A990"/>
+    <w:nsid w:val="2c1ae401"/>
     <w:multiLevelType w:val="multilevel"/>
     <w:lvl w:ilvl="0">
       <w:numFmt w:val="bullet"/>
       <w:lvlText w:val=" "/>
       <w:lvlJc w:val="left"/>
       <w:pPr>
-        <w:ind w:left="720" w:hanging="480"/>
+        <w:tabs>
+          <w:tab w:val="num" w:pos="0"/>
+        </w:tabs>
+        <w:ind w:left="480" w:hanging="480"/>
       </w:pPr>
     </w:lvl>
     <w:lvl w:ilvl="1">
@@ -309,7 +400,10 @@
       <w:lvlText w:val=" "/>
       <w:lvlJc w:val="left"/>
       <w:pPr>
-        <w:ind w:left="1440" w:hanging="480"/>
+        <w:tabs>
+          <w:tab w:val="num" w:pos="720"/>
+        </w:tabs>
+        <w:ind w:left="1200" w:hanging="480"/>
       </w:pPr>
     </w:lvl>
     <w:lvl w:ilvl="2">
@@ -317,7 +411,10 @@
       <w:lvlText w:val=" "/>
       <w:lvlJc w:val="left"/>
       <w:pPr>
-        <w:ind w:left="2160" w:hanging="480"/>
+        <w:tabs>
+          <w:tab w:val="num" w:pos="1440"/>
+        </w:tabs>
+        <w:ind w:left="1920" w:hanging="480"/>
       </w:pPr>
     </w:lvl>
     <w:lvl w:ilvl="3">
@@ -325,7 +422,10 @@
       <w:lvlText w:val=" "/>
       <w:lvlJc w:val="left"/>
       <w:pPr>
-        <w:ind w:left="2880" w:hanging="480"/>
+        <w:tabs>
+          <w:tab w:val="num" w:pos="2160"/>
+        </w:tabs>
+        <w:ind w:left="2640" w:hanging="480"/>
       </w:pPr>
     </w:lvl>
     <w:lvl w:ilvl="4">
@@ -333,7 +433,10 @@
       <w:lvlText w:val=" "/>
       <w:lvlJc w:val="left"/>
       <w:pPr>
-        <w:ind w:left="3600" w:hanging="480"/>
+        <w:tabs>
+          <w:tab w:val="num" w:pos="2880"/>
+        </w:tabs>
+        <w:ind w:left="3360" w:hanging="480"/>
       </w:pPr>
     </w:lvl>
     <w:lvl w:ilvl="5">
@@ -341,7 +444,10 @@
       <w:lvlText w:val=" "/>
       <w:lvlJc w:val="left"/>
       <w:pPr>
-        <w:ind w:left="4320" w:hanging="480"/>
+        <w:tabs>
+          <w:tab w:val="num" w:pos="3600"/>
+        </w:tabs>
+        <w:ind w:left="4080" w:hanging="480"/>
       </w:pPr>
     </w:lvl>
     <w:lvl w:ilvl="6">
@@ -349,7 +455,10 @@
       <w:lvlText w:val=" "/>
       <w:lvlJc w:val="left"/>
       <w:pPr>
-        <w:ind w:left="5040" w:hanging="480"/>
+        <w:tabs>
+          <w:tab w:val="num" w:pos="4320"/>
+        </w:tabs>
+        <w:ind w:left="4800" w:hanging="480"/>
       </w:pPr>
     </w:lvl>
     <w:lvl w:ilvl="7">
@@ -357,7 +466,10 @@
       <w:lvlText w:val=" "/>
       <w:lvlJc w:val="left"/>
       <w:pPr>
-        <w:ind w:left="5760" w:hanging="480"/>
+        <w:tabs>
+          <w:tab w:val="num" w:pos="5040"/>
+        </w:tabs>
+        <w:ind w:left="5520" w:hanging="480"/>
       </w:pPr>
     </w:lvl>
     <w:lvl w:ilvl="8">
@@ -365,19 +477,25 @@
       <w:lvlText w:val=" "/>
       <w:lvlJc w:val="left"/>
       <w:pPr>
-        <w:ind w:left="6480" w:hanging="480"/>
+        <w:tabs>
+          <w:tab w:val="num" w:pos="5760"/>
+        </w:tabs>
+        <w:ind w:left="6240" w:hanging="480"/>
       </w:pPr>
     </w:lvl>
   </w:abstractNum>
   <w:abstractNum w:abstractNumId="991">
-    <w:nsid w:val="A991"/>
+    <w:nsid w:val="ea454b4c"/>
     <w:multiLevelType w:val="multilevel"/>
     <w:lvl w:ilvl="0">
       <w:numFmt w:val="bullet"/>
       <w:lvlText w:val="•"/>
       <w:lvlJc w:val="left"/>
       <w:pPr>
-        <w:ind w:left="720" w:hanging="480"/>
+        <w:tabs>
+          <w:tab w:val="num" w:pos="0"/>
+        </w:tabs>
+        <w:ind w:left="480" w:hanging="480"/>
       </w:pPr>
     </w:lvl>
     <w:lvl w:ilvl="1">
@@ -385,7 +503,10 @@
       <w:lvlText w:val="–"/>
       <w:lvlJc w:val="left"/>
       <w:pPr>
-        <w:ind w:left="1440" w:hanging="480"/>
+        <w:tabs>
+          <w:tab w:val="num" w:pos="720"/>
+        </w:tabs>
+        <w:ind w:left="1200" w:hanging="480"/>
       </w:pPr>
     </w:lvl>
     <w:lvl w:ilvl="2">
@@ -393,7 +514,10 @@
       <w:lvlText w:val="•"/>
       <w:lvlJc w:val="left"/>
       <w:pPr>
-        <w:ind w:left="2160" w:hanging="480"/>
+        <w:tabs>
+          <w:tab w:val="num" w:pos="1440"/>
+        </w:tabs>
+        <w:ind w:left="1920" w:hanging="480"/>
       </w:pPr>
     </w:lvl>
     <w:lvl w:ilvl="3">
@@ -401,7 +525,10 @@
       <w:lvlText w:val="–"/>
       <w:lvlJc w:val="left"/>
       <w:pPr>
-        <w:ind w:left="2880" w:hanging="480"/>
+        <w:tabs>
+          <w:tab w:val="num" w:pos="2160"/>
+        </w:tabs>
+        <w:ind w:left="2640" w:hanging="480"/>
       </w:pPr>
     </w:lvl>
     <w:lvl w:ilvl="4">
@@ -409,7 +536,10 @@
       <w:lvlText w:val="•"/>
       <w:lvlJc w:val="left"/>
       <w:pPr>
-        <w:ind w:left="3600" w:hanging="480"/>
+        <w:tabs>
+          <w:tab w:val="num" w:pos="2880"/>
+        </w:tabs>
+        <w:ind w:left="3360" w:hanging="480"/>
       </w:pPr>
     </w:lvl>
     <w:lvl w:ilvl="5">
@@ -417,7 +547,10 @@
       <w:lvlText w:val="–"/>
       <w:lvlJc w:val="left"/>
       <w:pPr>
-        <w:ind w:left="4320" w:hanging="480"/>
+        <w:tabs>
+          <w:tab w:val="num" w:pos="3600"/>
+        </w:tabs>
+        <w:ind w:left="4080" w:hanging="480"/>
       </w:pPr>
     </w:lvl>
     <w:lvl w:ilvl="6">
@@ -425,7 +558,10 @@
       <w:lvlText w:val="•"/>
       <w:lvlJc w:val="left"/>
       <w:pPr>
-        <w:ind w:left="5040" w:hanging="480"/>
+        <w:tabs>
+          <w:tab w:val="num" w:pos="4320"/>
+        </w:tabs>
+        <w:ind w:left="4800" w:hanging="480"/>
       </w:pPr>
     </w:lvl>
     <w:lvl w:ilvl="7">
@@ -433,7 +569,10 @@
       <w:lvlText w:val="–"/>
       <w:lvlJc w:val="left"/>
       <w:pPr>
-        <w:ind w:left="5760" w:hanging="480"/>
+        <w:tabs>
+          <w:tab w:val="num" w:pos="5040"/>
+        </w:tabs>
+        <w:ind w:left="5520" w:hanging="480"/>
       </w:pPr>
     </w:lvl>
     <w:lvl w:ilvl="8">
@@ -441,7 +580,10 @@
       <w:lvlText w:val="•"/>
       <w:lvlJc w:val="left"/>
       <w:pPr>
-        <w:ind w:left="6480" w:hanging="480"/>
+        <w:tabs>
+          <w:tab w:val="num" w:pos="5760"/>
+        </w:tabs>
+        <w:ind w:left="6240" w:hanging="480"/>
       </w:pPr>
     </w:lvl>
   </w:abstractNum>
@@ -454,19 +596,22 @@
   <w:num w:numId="1002">
     <w:abstractNumId w:val="991"/>
   </w:num>
+  <w:num w:numId="1003">
+    <w:abstractNumId w:val="991"/>
+  </w:num>
 </w:numbering>
 </file>
 
 <file path=word/styles.xml><?xml version="1.0" encoding="utf-8"?>
-<w:styles xmlns:mc="http://schemas.openxmlformats.org/markup-compatibility/2006" xmlns:r="http://schemas.openxmlformats.org/officeDocument/2006/relationships" xmlns:w="http://schemas.openxmlformats.org/wordprocessingml/2006/main" xmlns:w14="http://schemas.microsoft.com/office/word/2010/wordml" xmlns:w15="http://schemas.microsoft.com/office/word/2012/wordml" xmlns:w16="http://schemas.microsoft.com/office/word/2018/wordml" xmlns:w16cex="http://schemas.microsoft.com/office/word/2018/wordml/cex" xmlns:w16cid="http://schemas.microsoft.com/office/word/2016/wordml/cid" xmlns:w16du="http://schemas.microsoft.com/office/word/2023/wordml/word16du" xmlns:w16sdtdh="http://schemas.microsoft.com/office/word/2020/wordml/sdtdatahash" xmlns:w16sdtfl="http://schemas.microsoft.com/office/word/2024/wordml/sdtformatlock" xmlns:w16se="http://schemas.microsoft.com/office/word/2015/wordml/symex" mc:Ignorable="w14 w15 w16se w16cid w16 w16cex w16sdtdh w16sdtfl w16du">
+<w:styles xmlns:mc="http://schemas.openxmlformats.org/markup-compatibility/2006" xmlns:r="http://schemas.openxmlformats.org/officeDocument/2006/relationships" xmlns:w="http://schemas.openxmlformats.org/wordprocessingml/2006/main" xmlns:w14="http://schemas.microsoft.com/office/word/2010/wordml" xmlns:w15="http://schemas.microsoft.com/office/word/2012/wordml" xmlns:w16cex="http://schemas.microsoft.com/office/word/2018/wordml/cex" xmlns:w16cid="http://schemas.microsoft.com/office/word/2016/wordml/cid" xmlns:w16="http://schemas.microsoft.com/office/word/2018/wordml" xmlns:w16du="http://schemas.microsoft.com/office/word/2023/wordml/word16du" xmlns:w16sdtdh="http://schemas.microsoft.com/office/word/2020/wordml/sdtdatahash" xmlns:w16sdtfl="http://schemas.microsoft.com/office/word/2024/wordml/sdtformatlock" xmlns:w16se="http://schemas.microsoft.com/office/word/2015/wordml/symex" mc:Ignorable="w14 w15 w16se w16cid w16 w16cex w16sdtdh w16sdtfl w16du">
   <w:docDefaults>
     <w:rPrDefault>
       <w:rPr>
-        <w:rFonts w:asciiTheme="minorHAnsi" w:cstheme="minorBidi" w:eastAsiaTheme="minorEastAsia" w:hAnsiTheme="minorHAnsi"/>
+        <w:rFonts w:asciiTheme="minorHAnsi" w:eastAsiaTheme="minorEastAsia" w:hAnsiTheme="minorHAnsi" w:cstheme="minorBidi"/>
         <w:kern w:val="2"/>
         <w:sz w:val="24"/>
         <w:szCs w:val="24"/>
-        <w:lang w:bidi="ar-SA" w:eastAsia="zh-CN" w:val="en-CA"/>
+        <w:lang w:val="en-CA" w:eastAsia="zh-CN" w:bidi="ar-SA"/>
         <w14:ligatures w14:val="standardContextual"/>
       </w:rPr>
     </w:rPrDefault>
@@ -476,17 +621,17 @@
       </w:pPr>
     </w:pPrDefault>
   </w:docDefaults>
-  <w:latentStyles w:count="376" w:defLockedState="0" w:defQFormat="0" w:defSemiHidden="0" w:defUIPriority="99" w:defUnhideWhenUsed="0">
-    <w:lsdException w:name="Normal" w:qFormat="1" w:uiPriority="0"/>
-    <w:lsdException w:name="heading 1" w:qFormat="1" w:uiPriority="9"/>
-    <w:lsdException w:name="heading 2" w:qFormat="1" w:semiHidden="1" w:uiPriority="9" w:unhideWhenUsed="1"/>
-    <w:lsdException w:name="heading 3" w:qFormat="1" w:semiHidden="1" w:uiPriority="9" w:unhideWhenUsed="1"/>
-    <w:lsdException w:name="heading 4" w:qFormat="1" w:semiHidden="1" w:uiPriority="9" w:unhideWhenUsed="1"/>
-    <w:lsdException w:name="heading 5" w:qFormat="1" w:semiHidden="1" w:uiPriority="9" w:unhideWhenUsed="1"/>
-    <w:lsdException w:name="heading 6" w:qFormat="1" w:semiHidden="1" w:uiPriority="9" w:unhideWhenUsed="1"/>
-    <w:lsdException w:name="heading 7" w:qFormat="1" w:semiHidden="1" w:uiPriority="9" w:unhideWhenUsed="1"/>
-    <w:lsdException w:name="heading 8" w:qFormat="1" w:semiHidden="1" w:uiPriority="9" w:unhideWhenUsed="1"/>
-    <w:lsdException w:name="heading 9" w:qFormat="1" w:semiHidden="1" w:uiPriority="9" w:unhideWhenUsed="1"/>
+  <w:latentStyles w:defLockedState="0" w:defUIPriority="99" w:defSemiHidden="0" w:defUnhideWhenUsed="0" w:defQFormat="0" w:count="376">
+    <w:lsdException w:name="Normal" w:uiPriority="0" w:qFormat="1"/>
+    <w:lsdException w:name="heading 1" w:uiPriority="9" w:qFormat="1"/>
+    <w:lsdException w:name="heading 2" w:semiHidden="1" w:uiPriority="9" w:unhideWhenUsed="1" w:qFormat="1"/>
+    <w:lsdException w:name="heading 3" w:semiHidden="1" w:uiPriority="9" w:unhideWhenUsed="1" w:qFormat="1"/>
+    <w:lsdException w:name="heading 4" w:semiHidden="1" w:uiPriority="9" w:unhideWhenUsed="1" w:qFormat="1"/>
+    <w:lsdException w:name="heading 5" w:semiHidden="1" w:uiPriority="9" w:unhideWhenUsed="1" w:qFormat="1"/>
+    <w:lsdException w:name="heading 6" w:semiHidden="1" w:uiPriority="9" w:unhideWhenUsed="1" w:qFormat="1"/>
+    <w:lsdException w:name="heading 7" w:semiHidden="1" w:uiPriority="9" w:unhideWhenUsed="1" w:qFormat="1"/>
+    <w:lsdException w:name="heading 8" w:semiHidden="1" w:uiPriority="9" w:unhideWhenUsed="1" w:qFormat="1"/>
+    <w:lsdException w:name="heading 9" w:semiHidden="1" w:uiPriority="9" w:unhideWhenUsed="1" w:qFormat="1"/>
     <w:lsdException w:name="index 1" w:semiHidden="1" w:unhideWhenUsed="1"/>
     <w:lsdException w:name="index 2" w:semiHidden="1" w:unhideWhenUsed="1"/>
     <w:lsdException w:name="index 3" w:semiHidden="1" w:unhideWhenUsed="1"/>
@@ -511,7 +656,7 @@
     <w:lsdException w:name="header" w:semiHidden="1" w:unhideWhenUsed="1"/>
     <w:lsdException w:name="footer" w:semiHidden="1" w:unhideWhenUsed="1"/>
     <w:lsdException w:name="index heading" w:semiHidden="1" w:unhideWhenUsed="1"/>
-    <w:lsdException w:name="caption" w:qFormat="1" w:semiHidden="1" w:uiPriority="35" w:unhideWhenUsed="1"/>
+    <w:lsdException w:name="caption" w:semiHidden="1" w:uiPriority="35" w:unhideWhenUsed="1" w:qFormat="1"/>
     <w:lsdException w:name="table of figures" w:semiHidden="1" w:unhideWhenUsed="1"/>
     <w:lsdException w:name="envelope address" w:semiHidden="1" w:unhideWhenUsed="1"/>
     <w:lsdException w:name="envelope return" w:semiHidden="1" w:unhideWhenUsed="1"/>
@@ -539,7 +684,7 @@
     <w:lsdException w:name="List Number 3" w:semiHidden="1" w:unhideWhenUsed="1"/>
     <w:lsdException w:name="List Number 4" w:semiHidden="1" w:unhideWhenUsed="1"/>
     <w:lsdException w:name="List Number 5" w:semiHidden="1" w:unhideWhenUsed="1"/>
-    <w:lsdException w:name="Title" w:qFormat="1" w:uiPriority="10"/>
+    <w:lsdException w:name="Title" w:uiPriority="10" w:qFormat="1"/>
     <w:lsdException w:name="Closing" w:semiHidden="1" w:unhideWhenUsed="1"/>
     <w:lsdException w:name="Signature" w:semiHidden="1" w:unhideWhenUsed="1"/>
     <w:lsdException w:name="Default Paragraph Font" w:semiHidden="1" w:uiPriority="1" w:unhideWhenUsed="1"/>
@@ -551,7 +696,7 @@
     <w:lsdException w:name="List Continue 4" w:semiHidden="1" w:unhideWhenUsed="1"/>
     <w:lsdException w:name="List Continue 5" w:semiHidden="1" w:unhideWhenUsed="1"/>
     <w:lsdException w:name="Message Header" w:semiHidden="1" w:unhideWhenUsed="1"/>
-    <w:lsdException w:name="Subtitle" w:qFormat="1" w:uiPriority="11"/>
+    <w:lsdException w:name="Subtitle" w:uiPriority="11" w:qFormat="1"/>
     <w:lsdException w:name="Salutation" w:semiHidden="1" w:unhideWhenUsed="1"/>
     <w:lsdException w:name="Date" w:semiHidden="1" w:unhideWhenUsed="1"/>
     <w:lsdException w:name="Body Text First Indent" w:semiHidden="1" w:unhideWhenUsed="1"/>
@@ -564,8 +709,8 @@
     <w:lsdException w:name="Block Text" w:semiHidden="1" w:unhideWhenUsed="1"/>
     <w:lsdException w:name="Hyperlink" w:semiHidden="1" w:unhideWhenUsed="1"/>
     <w:lsdException w:name="FollowedHyperlink" w:semiHidden="1" w:unhideWhenUsed="1"/>
-    <w:lsdException w:name="Strong" w:qFormat="1" w:uiPriority="22"/>
-    <w:lsdException w:name="Emphasis" w:qFormat="1" w:uiPriority="20"/>
+    <w:lsdException w:name="Strong" w:uiPriority="22" w:qFormat="1"/>
+    <w:lsdException w:name="Emphasis" w:uiPriority="20" w:qFormat="1"/>
     <w:lsdException w:name="Document Map" w:semiHidden="1" w:unhideWhenUsed="1"/>
     <w:lsdException w:name="Plain Text" w:semiHidden="1" w:unhideWhenUsed="1"/>
     <w:lsdException w:name="E-mail Signature" w:semiHidden="1" w:unhideWhenUsed="1"/>
@@ -634,7 +779,7 @@
     <w:lsdException w:name="Table Grid" w:uiPriority="39"/>
     <w:lsdException w:name="Table Theme" w:semiHidden="1" w:unhideWhenUsed="1"/>
     <w:lsdException w:name="Placeholder Text" w:semiHidden="1"/>
-    <w:lsdException w:name="No Spacing" w:qFormat="1" w:uiPriority="1"/>
+    <w:lsdException w:name="No Spacing" w:uiPriority="1" w:qFormat="1"/>
     <w:lsdException w:name="Light Shading" w:uiPriority="60"/>
     <w:lsdException w:name="Light List" w:uiPriority="61"/>
     <w:lsdException w:name="Light Grid" w:uiPriority="62"/>
@@ -656,9 +801,9 @@
     <w:lsdException w:name="Medium Shading 2 Accent 1" w:uiPriority="64"/>
     <w:lsdException w:name="Medium List 1 Accent 1" w:uiPriority="65"/>
     <w:lsdException w:name="Revision" w:semiHidden="1"/>
-    <w:lsdException w:name="List Paragraph" w:qFormat="1" w:uiPriority="34"/>
-    <w:lsdException w:name="Quote" w:qFormat="1" w:uiPriority="29"/>
-    <w:lsdException w:name="Intense Quote" w:qFormat="1" w:uiPriority="30"/>
+    <w:lsdException w:name="List Paragraph" w:uiPriority="34" w:qFormat="1"/>
+    <w:lsdException w:name="Quote" w:uiPriority="29" w:qFormat="1"/>
+    <w:lsdException w:name="Intense Quote" w:uiPriority="30" w:qFormat="1"/>
     <w:lsdException w:name="Medium List 2 Accent 1" w:uiPriority="66"/>
     <w:lsdException w:name="Medium Grid 1 Accent 1" w:uiPriority="67"/>
     <w:lsdException w:name="Medium Grid 2 Accent 1" w:uiPriority="68"/>
@@ -737,13 +882,13 @@
     <w:lsdException w:name="Colorful Shading Accent 6" w:uiPriority="71"/>
     <w:lsdException w:name="Colorful List Accent 6" w:uiPriority="72"/>
     <w:lsdException w:name="Colorful Grid Accent 6" w:uiPriority="73"/>
-    <w:lsdException w:name="Subtle Emphasis" w:qFormat="1" w:uiPriority="19"/>
-    <w:lsdException w:name="Intense Emphasis" w:qFormat="1" w:uiPriority="21"/>
-    <w:lsdException w:name="Subtle Reference" w:qFormat="1" w:uiPriority="31"/>
-    <w:lsdException w:name="Intense Reference" w:qFormat="1" w:uiPriority="32"/>
-    <w:lsdException w:name="Book Title" w:qFormat="1" w:uiPriority="33"/>
+    <w:lsdException w:name="Subtle Emphasis" w:uiPriority="19" w:qFormat="1"/>
+    <w:lsdException w:name="Intense Emphasis" w:uiPriority="21" w:qFormat="1"/>
+    <w:lsdException w:name="Subtle Reference" w:uiPriority="31" w:qFormat="1"/>
+    <w:lsdException w:name="Intense Reference" w:uiPriority="32" w:qFormat="1"/>
+    <w:lsdException w:name="Book Title" w:uiPriority="33" w:qFormat="1"/>
     <w:lsdException w:name="Bibliography" w:semiHidden="1" w:uiPriority="37" w:unhideWhenUsed="1"/>
-    <w:lsdException w:name="TOC Heading" w:qFormat="1" w:semiHidden="1" w:uiPriority="39" w:unhideWhenUsed="1"/>
+    <w:lsdException w:name="TOC Heading" w:semiHidden="1" w:uiPriority="39" w:unhideWhenUsed="1" w:qFormat="1"/>
     <w:lsdException w:name="Plain Table 1" w:uiPriority="41"/>
     <w:lsdException w:name="Plain Table 2" w:uiPriority="42"/>
     <w:lsdException w:name="Plain Table 3" w:uiPriority="43"/>
@@ -854,11 +999,11 @@
     <w:lsdException w:name="Unresolved Mention" w:semiHidden="1" w:unhideWhenUsed="1"/>
     <w:lsdException w:name="Smart Link" w:semiHidden="1" w:unhideWhenUsed="1"/>
   </w:latentStyles>
-  <w:style w:default="1" w:styleId="Normal" w:type="paragraph">
+  <w:style w:type="paragraph" w:default="1" w:styleId="Normal">
     <w:name w:val="Normal"/>
     <w:qFormat/>
   </w:style>
-  <w:style w:styleId="Heading1" w:type="paragraph">
+  <w:style w:type="paragraph" w:styleId="Heading1">
     <w:name w:val="heading 1"/>
     <w:basedOn w:val="Normal"/>
     <w:next w:val="Normal"/>
@@ -869,17 +1014,17 @@
     <w:pPr>
       <w:keepNext/>
       <w:keepLines/>
-      <w:spacing w:after="80" w:before="360"/>
+      <w:spacing w:before="360" w:after="80"/>
       <w:outlineLvl w:val="0"/>
     </w:pPr>
     <w:rPr>
-      <w:rFonts w:asciiTheme="majorHAnsi" w:cstheme="majorBidi" w:eastAsiaTheme="majorEastAsia" w:hAnsiTheme="majorHAnsi"/>
-      <w:color w:themeColor="accent1" w:themeShade="BF" w:val="0F4761"/>
+      <w:rFonts w:asciiTheme="majorHAnsi" w:eastAsiaTheme="majorEastAsia" w:hAnsiTheme="majorHAnsi" w:cstheme="majorBidi"/>
+      <w:color w:val="0F4761" w:themeColor="accent1" w:themeShade="BF"/>
       <w:sz w:val="40"/>
       <w:szCs w:val="40"/>
     </w:rPr>
   </w:style>
-  <w:style w:styleId="Heading2" w:type="paragraph">
+  <w:style w:type="paragraph" w:styleId="Heading2">
     <w:name w:val="heading 2"/>
     <w:basedOn w:val="Normal"/>
     <w:next w:val="Normal"/>
@@ -892,17 +1037,17 @@
     <w:pPr>
       <w:keepNext/>
       <w:keepLines/>
-      <w:spacing w:after="80" w:before="160"/>
+      <w:spacing w:before="160" w:after="80"/>
       <w:outlineLvl w:val="1"/>
     </w:pPr>
     <w:rPr>
-      <w:rFonts w:asciiTheme="majorHAnsi" w:cstheme="majorBidi" w:eastAsiaTheme="majorEastAsia" w:hAnsiTheme="majorHAnsi"/>
-      <w:color w:themeColor="accent1" w:themeShade="BF" w:val="0F4761"/>
+      <w:rFonts w:asciiTheme="majorHAnsi" w:eastAsiaTheme="majorEastAsia" w:hAnsiTheme="majorHAnsi" w:cstheme="majorBidi"/>
+      <w:color w:val="0F4761" w:themeColor="accent1" w:themeShade="BF"/>
       <w:sz w:val="32"/>
       <w:szCs w:val="32"/>
     </w:rPr>
   </w:style>
-  <w:style w:styleId="Heading3" w:type="paragraph">
+  <w:style w:type="paragraph" w:styleId="Heading3">
     <w:name w:val="heading 3"/>
     <w:basedOn w:val="Normal"/>
     <w:next w:val="Normal"/>
@@ -915,17 +1060,17 @@
     <w:pPr>
       <w:keepNext/>
       <w:keepLines/>
-      <w:spacing w:after="80" w:before="160"/>
+      <w:spacing w:before="160" w:after="80"/>
       <w:outlineLvl w:val="2"/>
     </w:pPr>
     <w:rPr>
-      <w:rFonts w:cstheme="majorBidi" w:eastAsiaTheme="majorEastAsia"/>
-      <w:color w:themeColor="accent1" w:themeShade="BF" w:val="0F4761"/>
+      <w:rFonts w:eastAsiaTheme="majorEastAsia" w:cstheme="majorBidi"/>
+      <w:color w:val="0F4761" w:themeColor="accent1" w:themeShade="BF"/>
       <w:sz w:val="28"/>
       <w:szCs w:val="28"/>
     </w:rPr>
   </w:style>
-  <w:style w:styleId="Heading4" w:type="paragraph">
+  <w:style w:type="paragraph" w:styleId="Heading4">
     <w:name w:val="heading 4"/>
     <w:basedOn w:val="Normal"/>
     <w:next w:val="Normal"/>
@@ -938,17 +1083,17 @@
     <w:pPr>
       <w:keepNext/>
       <w:keepLines/>
-      <w:spacing w:after="40" w:before="80"/>
+      <w:spacing w:before="80" w:after="40"/>
       <w:outlineLvl w:val="3"/>
     </w:pPr>
     <w:rPr>
-      <w:rFonts w:cstheme="majorBidi" w:eastAsiaTheme="majorEastAsia"/>
+      <w:rFonts w:eastAsiaTheme="majorEastAsia" w:cstheme="majorBidi"/>
       <w:i/>
       <w:iCs/>
-      <w:color w:themeColor="accent1" w:themeShade="BF" w:val="0F4761"/>
-    </w:rPr>
-  </w:style>
-  <w:style w:styleId="Heading5" w:type="paragraph">
+      <w:color w:val="0F4761" w:themeColor="accent1" w:themeShade="BF"/>
+    </w:rPr>
+  </w:style>
+  <w:style w:type="paragraph" w:styleId="Heading5">
     <w:name w:val="heading 5"/>
     <w:basedOn w:val="Normal"/>
     <w:next w:val="Normal"/>
@@ -961,15 +1106,15 @@
     <w:pPr>
       <w:keepNext/>
       <w:keepLines/>
-      <w:spacing w:after="40" w:before="80"/>
+      <w:spacing w:before="80" w:after="40"/>
       <w:outlineLvl w:val="4"/>
     </w:pPr>
     <w:rPr>
-      <w:rFonts w:cstheme="majorBidi" w:eastAsiaTheme="majorEastAsia"/>
-      <w:color w:themeColor="accent1" w:themeShade="BF" w:val="0F4761"/>
-    </w:rPr>
-  </w:style>
-  <w:style w:styleId="Heading6" w:type="paragraph">
+      <w:rFonts w:eastAsiaTheme="majorEastAsia" w:cstheme="majorBidi"/>
+      <w:color w:val="0F4761" w:themeColor="accent1" w:themeShade="BF"/>
+    </w:rPr>
+  </w:style>
+  <w:style w:type="paragraph" w:styleId="Heading6">
     <w:name w:val="heading 6"/>
     <w:basedOn w:val="Normal"/>
     <w:next w:val="Normal"/>
@@ -982,17 +1127,17 @@
     <w:pPr>
       <w:keepNext/>
       <w:keepLines/>
-      <w:spacing w:after="0" w:before="40"/>
+      <w:spacing w:before="40" w:after="0"/>
       <w:outlineLvl w:val="5"/>
     </w:pPr>
     <w:rPr>
-      <w:rFonts w:cstheme="majorBidi" w:eastAsiaTheme="majorEastAsia"/>
+      <w:rFonts w:eastAsiaTheme="majorEastAsia" w:cstheme="majorBidi"/>
       <w:i/>
       <w:iCs/>
-      <w:color w:themeColor="text1" w:themeTint="A6" w:val="595959"/>
-    </w:rPr>
-  </w:style>
-  <w:style w:styleId="Heading7" w:type="paragraph">
+      <w:color w:val="595959" w:themeColor="text1" w:themeTint="A6"/>
+    </w:rPr>
+  </w:style>
+  <w:style w:type="paragraph" w:styleId="Heading7">
     <w:name w:val="heading 7"/>
     <w:basedOn w:val="Normal"/>
     <w:next w:val="Normal"/>
@@ -1005,15 +1150,15 @@
     <w:pPr>
       <w:keepNext/>
       <w:keepLines/>
-      <w:spacing w:after="0" w:before="40"/>
+      <w:spacing w:before="40" w:after="0"/>
       <w:outlineLvl w:val="6"/>
     </w:pPr>
     <w:rPr>
-      <w:rFonts w:cstheme="majorBidi" w:eastAsiaTheme="majorEastAsia"/>
-      <w:color w:themeColor="text1" w:themeTint="A6" w:val="595959"/>
-    </w:rPr>
-  </w:style>
-  <w:style w:styleId="Heading8" w:type="paragraph">
+      <w:rFonts w:eastAsiaTheme="majorEastAsia" w:cstheme="majorBidi"/>
+      <w:color w:val="595959" w:themeColor="text1" w:themeTint="A6"/>
+    </w:rPr>
+  </w:style>
+  <w:style w:type="paragraph" w:styleId="Heading8">
     <w:name w:val="heading 8"/>
     <w:basedOn w:val="Normal"/>
     <w:next w:val="Normal"/>
@@ -1030,13 +1175,13 @@
       <w:outlineLvl w:val="7"/>
     </w:pPr>
     <w:rPr>
-      <w:rFonts w:cstheme="majorBidi" w:eastAsiaTheme="majorEastAsia"/>
+      <w:rFonts w:eastAsiaTheme="majorEastAsia" w:cstheme="majorBidi"/>
       <w:i/>
       <w:iCs/>
-      <w:color w:themeColor="text1" w:themeTint="D8" w:val="272727"/>
-    </w:rPr>
-  </w:style>
-  <w:style w:styleId="Heading9" w:type="paragraph">
+      <w:color w:val="272727" w:themeColor="text1" w:themeTint="D8"/>
+    </w:rPr>
+  </w:style>
+  <w:style w:type="paragraph" w:styleId="Heading9">
     <w:name w:val="heading 9"/>
     <w:basedOn w:val="Normal"/>
     <w:next w:val="Normal"/>
@@ -1053,50 +1198,50 @@
       <w:outlineLvl w:val="8"/>
     </w:pPr>
     <w:rPr>
-      <w:rFonts w:cstheme="majorBidi" w:eastAsiaTheme="majorEastAsia"/>
-      <w:color w:themeColor="text1" w:themeTint="D8" w:val="272727"/>
-    </w:rPr>
-  </w:style>
-  <w:style w:default="1" w:styleId="DefaultParagraphFont" w:type="character">
+      <w:rFonts w:eastAsiaTheme="majorEastAsia" w:cstheme="majorBidi"/>
+      <w:color w:val="272727" w:themeColor="text1" w:themeTint="D8"/>
+    </w:rPr>
+  </w:style>
+  <w:style w:type="character" w:default="1" w:styleId="DefaultParagraphFont">
     <w:name w:val="Default Paragraph Font"/>
     <w:uiPriority w:val="1"/>
     <w:unhideWhenUsed/>
   </w:style>
-  <w:style w:default="1" w:styleId="TableNormal" w:type="table">
+  <w:style w:type="table" w:default="1" w:styleId="TableNormal">
     <w:name w:val="Normal Table"/>
     <w:uiPriority w:val="99"/>
     <w:semiHidden/>
     <w:unhideWhenUsed/>
     <w:tblPr>
-      <w:tblInd w:type="dxa" w:w="0"/>
+      <w:tblInd w:w="0" w:type="dxa"/>
       <w:tblCellMar>
-        <w:top w:type="dxa" w:w="0"/>
-        <w:left w:type="dxa" w:w="108"/>
-        <w:bottom w:type="dxa" w:w="0"/>
-        <w:right w:type="dxa" w:w="108"/>
+        <w:top w:w="0" w:type="dxa"/>
+        <w:left w:w="108" w:type="dxa"/>
+        <w:bottom w:w="0" w:type="dxa"/>
+        <w:right w:w="108" w:type="dxa"/>
       </w:tblCellMar>
     </w:tblPr>
   </w:style>
-  <w:style w:default="1" w:styleId="NoList" w:type="numbering">
+  <w:style w:type="numbering" w:default="1" w:styleId="NoList">
     <w:name w:val="No List"/>
     <w:uiPriority w:val="99"/>
     <w:semiHidden/>
     <w:unhideWhenUsed/>
   </w:style>
-  <w:style w:customStyle="1" w:styleId="Heading1Char" w:type="character">
+  <w:style w:type="character" w:customStyle="1" w:styleId="Heading1Char">
     <w:name w:val="Heading 1 Char"/>
     <w:basedOn w:val="DefaultParagraphFont"/>
     <w:link w:val="Heading1"/>
     <w:uiPriority w:val="9"/>
     <w:rsid w:val="008B663D"/>
     <w:rPr>
-      <w:rFonts w:asciiTheme="majorHAnsi" w:cstheme="majorBidi" w:eastAsiaTheme="majorEastAsia" w:hAnsiTheme="majorHAnsi"/>
-      <w:color w:themeColor="accent1" w:themeShade="BF" w:val="0F4761"/>
+      <w:rFonts w:asciiTheme="majorHAnsi" w:eastAsiaTheme="majorEastAsia" w:hAnsiTheme="majorHAnsi" w:cstheme="majorBidi"/>
+      <w:color w:val="0F4761" w:themeColor="accent1" w:themeShade="BF"/>
       <w:sz w:val="40"/>
       <w:szCs w:val="40"/>
     </w:rPr>
   </w:style>
-  <w:style w:customStyle="1" w:styleId="Heading2Char" w:type="character">
+  <w:style w:type="character" w:customStyle="1" w:styleId="Heading2Char">
     <w:name w:val="Heading 2 Char"/>
     <w:basedOn w:val="DefaultParagraphFont"/>
     <w:link w:val="Heading2"/>
@@ -1104,13 +1249,13 @@
     <w:semiHidden/>
     <w:rsid w:val="008B663D"/>
     <w:rPr>
-      <w:rFonts w:asciiTheme="majorHAnsi" w:cstheme="majorBidi" w:eastAsiaTheme="majorEastAsia" w:hAnsiTheme="majorHAnsi"/>
-      <w:color w:themeColor="accent1" w:themeShade="BF" w:val="0F4761"/>
+      <w:rFonts w:asciiTheme="majorHAnsi" w:eastAsiaTheme="majorEastAsia" w:hAnsiTheme="majorHAnsi" w:cstheme="majorBidi"/>
+      <w:color w:val="0F4761" w:themeColor="accent1" w:themeShade="BF"/>
       <w:sz w:val="32"/>
       <w:szCs w:val="32"/>
     </w:rPr>
   </w:style>
-  <w:style w:customStyle="1" w:styleId="Heading3Char" w:type="character">
+  <w:style w:type="character" w:customStyle="1" w:styleId="Heading3Char">
     <w:name w:val="Heading 3 Char"/>
     <w:basedOn w:val="DefaultParagraphFont"/>
     <w:link w:val="Heading3"/>
@@ -1118,13 +1263,13 @@
     <w:semiHidden/>
     <w:rsid w:val="008B663D"/>
     <w:rPr>
-      <w:rFonts w:cstheme="majorBidi" w:eastAsiaTheme="majorEastAsia"/>
-      <w:color w:themeColor="accent1" w:themeShade="BF" w:val="0F4761"/>
+      <w:rFonts w:eastAsiaTheme="majorEastAsia" w:cstheme="majorBidi"/>
+      <w:color w:val="0F4761" w:themeColor="accent1" w:themeShade="BF"/>
       <w:sz w:val="28"/>
       <w:szCs w:val="28"/>
     </w:rPr>
   </w:style>
-  <w:style w:customStyle="1" w:styleId="Heading4Char" w:type="character">
+  <w:style w:type="character" w:customStyle="1" w:styleId="Heading4Char">
     <w:name w:val="Heading 4 Char"/>
     <w:basedOn w:val="DefaultParagraphFont"/>
     <w:link w:val="Heading4"/>
@@ -1132,13 +1277,13 @@
     <w:semiHidden/>
     <w:rsid w:val="008B663D"/>
     <w:rPr>
-      <w:rFonts w:cstheme="majorBidi" w:eastAsiaTheme="majorEastAsia"/>
+      <w:rFonts w:eastAsiaTheme="majorEastAsia" w:cstheme="majorBidi"/>
       <w:i/>
       <w:iCs/>
-      <w:color w:themeColor="accent1" w:themeShade="BF" w:val="0F4761"/>
-    </w:rPr>
-  </w:style>
-  <w:style w:customStyle="1" w:styleId="Heading5Char" w:type="character">
+      <w:color w:val="0F4761" w:themeColor="accent1" w:themeShade="BF"/>
+    </w:rPr>
+  </w:style>
+  <w:style w:type="character" w:customStyle="1" w:styleId="Heading5Char">
     <w:name w:val="Heading 5 Char"/>
     <w:basedOn w:val="DefaultParagraphFont"/>
     <w:link w:val="Heading5"/>
@@ -1146,11 +1291,11 @@
     <w:semiHidden/>
     <w:rsid w:val="008B663D"/>
     <w:rPr>
-      <w:rFonts w:cstheme="majorBidi" w:eastAsiaTheme="majorEastAsia"/>
-      <w:color w:themeColor="accent1" w:themeShade="BF" w:val="0F4761"/>
-    </w:rPr>
-  </w:style>
-  <w:style w:customStyle="1" w:styleId="Heading6Char" w:type="character">
+      <w:rFonts w:eastAsiaTheme="majorEastAsia" w:cstheme="majorBidi"/>
+      <w:color w:val="0F4761" w:themeColor="accent1" w:themeShade="BF"/>
+    </w:rPr>
+  </w:style>
+  <w:style w:type="character" w:customStyle="1" w:styleId="Heading6Char">
     <w:name w:val="Heading 6 Char"/>
     <w:basedOn w:val="DefaultParagraphFont"/>
     <w:link w:val="Heading6"/>
@@ -1158,13 +1303,13 @@
     <w:semiHidden/>
     <w:rsid w:val="008B663D"/>
     <w:rPr>
-      <w:rFonts w:cstheme="majorBidi" w:eastAsiaTheme="majorEastAsia"/>
+      <w:rFonts w:eastAsiaTheme="majorEastAsia" w:cstheme="majorBidi"/>
       <w:i/>
       <w:iCs/>
-      <w:color w:themeColor="text1" w:themeTint="A6" w:val="595959"/>
-    </w:rPr>
-  </w:style>
-  <w:style w:customStyle="1" w:styleId="Heading7Char" w:type="character">
+      <w:color w:val="595959" w:themeColor="text1" w:themeTint="A6"/>
+    </w:rPr>
+  </w:style>
+  <w:style w:type="character" w:customStyle="1" w:styleId="Heading7Char">
     <w:name w:val="Heading 7 Char"/>
     <w:basedOn w:val="DefaultParagraphFont"/>
     <w:link w:val="Heading7"/>
@@ -1172,11 +1317,11 @@
     <w:semiHidden/>
     <w:rsid w:val="008B663D"/>
     <w:rPr>
-      <w:rFonts w:cstheme="majorBidi" w:eastAsiaTheme="majorEastAsia"/>
-      <w:color w:themeColor="text1" w:themeTint="A6" w:val="595959"/>
-    </w:rPr>
-  </w:style>
-  <w:style w:customStyle="1" w:styleId="Heading8Char" w:type="character">
+      <w:rFonts w:eastAsiaTheme="majorEastAsia" w:cstheme="majorBidi"/>
+      <w:color w:val="595959" w:themeColor="text1" w:themeTint="A6"/>
+    </w:rPr>
+  </w:style>
+  <w:style w:type="character" w:customStyle="1" w:styleId="Heading8Char">
     <w:name w:val="Heading 8 Char"/>
     <w:basedOn w:val="DefaultParagraphFont"/>
     <w:link w:val="Heading8"/>
@@ -1184,13 +1329,13 @@
     <w:semiHidden/>
     <w:rsid w:val="008B663D"/>
     <w:rPr>
-      <w:rFonts w:cstheme="majorBidi" w:eastAsiaTheme="majorEastAsia"/>
+      <w:rFonts w:eastAsiaTheme="majorEastAsia" w:cstheme="majorBidi"/>
       <w:i/>
       <w:iCs/>
-      <w:color w:themeColor="text1" w:themeTint="D8" w:val="272727"/>
-    </w:rPr>
-  </w:style>
-  <w:style w:customStyle="1" w:styleId="Heading9Char" w:type="character">
+      <w:color w:val="272727" w:themeColor="text1" w:themeTint="D8"/>
+    </w:rPr>
+  </w:style>
+  <w:style w:type="character" w:customStyle="1" w:styleId="Heading9Char">
     <w:name w:val="Heading 9 Char"/>
     <w:basedOn w:val="DefaultParagraphFont"/>
     <w:link w:val="Heading9"/>
@@ -1198,11 +1343,11 @@
     <w:semiHidden/>
     <w:rsid w:val="008B663D"/>
     <w:rPr>
-      <w:rFonts w:cstheme="majorBidi" w:eastAsiaTheme="majorEastAsia"/>
-      <w:color w:themeColor="text1" w:themeTint="D8" w:val="272727"/>
-    </w:rPr>
-  </w:style>
-  <w:style w:styleId="Title" w:type="paragraph">
+      <w:rFonts w:eastAsiaTheme="majorEastAsia" w:cstheme="majorBidi"/>
+      <w:color w:val="272727" w:themeColor="text1" w:themeTint="D8"/>
+    </w:rPr>
+  </w:style>
+  <w:style w:type="paragraph" w:styleId="Title">
     <w:name w:val="Title"/>
     <w:basedOn w:val="Normal"/>
     <w:next w:val="Normal"/>
@@ -1215,28 +1360,28 @@
       <w:contextualSpacing/>
     </w:pPr>
     <w:rPr>
-      <w:rFonts w:asciiTheme="majorHAnsi" w:cstheme="majorBidi" w:eastAsiaTheme="majorEastAsia" w:hAnsiTheme="majorHAnsi"/>
+      <w:rFonts w:asciiTheme="majorHAnsi" w:eastAsiaTheme="majorEastAsia" w:hAnsiTheme="majorHAnsi" w:cstheme="majorBidi"/>
       <w:spacing w:val="-10"/>
       <w:kern w:val="28"/>
       <w:sz w:val="56"/>
       <w:szCs w:val="56"/>
     </w:rPr>
   </w:style>
-  <w:style w:customStyle="1" w:styleId="TitleChar" w:type="character">
+  <w:style w:type="character" w:customStyle="1" w:styleId="TitleChar">
     <w:name w:val="Title Char"/>
     <w:basedOn w:val="DefaultParagraphFont"/>
     <w:link w:val="Title"/>
     <w:uiPriority w:val="10"/>
     <w:rsid w:val="008B663D"/>
     <w:rPr>
-      <w:rFonts w:asciiTheme="majorHAnsi" w:cstheme="majorBidi" w:eastAsiaTheme="majorEastAsia" w:hAnsiTheme="majorHAnsi"/>
+      <w:rFonts w:asciiTheme="majorHAnsi" w:eastAsiaTheme="majorEastAsia" w:hAnsiTheme="majorHAnsi" w:cstheme="majorBidi"/>
       <w:spacing w:val="-10"/>
       <w:kern w:val="28"/>
       <w:sz w:val="56"/>
       <w:szCs w:val="56"/>
     </w:rPr>
   </w:style>
-  <w:style w:styleId="Subtitle" w:type="paragraph">
+  <w:style w:type="paragraph" w:styleId="Subtitle">
     <w:name w:val="Subtitle"/>
     <w:basedOn w:val="Normal"/>
     <w:next w:val="Normal"/>
@@ -1250,28 +1395,28 @@
       </w:numPr>
     </w:pPr>
     <w:rPr>
-      <w:rFonts w:cstheme="majorBidi" w:eastAsiaTheme="majorEastAsia"/>
-      <w:color w:themeColor="text1" w:themeTint="A6" w:val="595959"/>
+      <w:rFonts w:eastAsiaTheme="majorEastAsia" w:cstheme="majorBidi"/>
+      <w:color w:val="595959" w:themeColor="text1" w:themeTint="A6"/>
       <w:spacing w:val="15"/>
       <w:sz w:val="28"/>
       <w:szCs w:val="28"/>
     </w:rPr>
   </w:style>
-  <w:style w:customStyle="1" w:styleId="SubtitleChar" w:type="character">
+  <w:style w:type="character" w:customStyle="1" w:styleId="SubtitleChar">
     <w:name w:val="Subtitle Char"/>
     <w:basedOn w:val="DefaultParagraphFont"/>
     <w:link w:val="Subtitle"/>
     <w:uiPriority w:val="11"/>
     <w:rsid w:val="008B663D"/>
     <w:rPr>
-      <w:rFonts w:cstheme="majorBidi" w:eastAsiaTheme="majorEastAsia"/>
-      <w:color w:themeColor="text1" w:themeTint="A6" w:val="595959"/>
+      <w:rFonts w:eastAsiaTheme="majorEastAsia" w:cstheme="majorBidi"/>
+      <w:color w:val="595959" w:themeColor="text1" w:themeTint="A6"/>
       <w:spacing w:val="15"/>
       <w:sz w:val="28"/>
       <w:szCs w:val="28"/>
     </w:rPr>
   </w:style>
-  <w:style w:styleId="Quote" w:type="paragraph">
+  <w:style w:type="paragraph" w:styleId="Quote">
     <w:name w:val="Quote"/>
     <w:basedOn w:val="Normal"/>
     <w:next w:val="Normal"/>
@@ -1286,10 +1431,10 @@
     <w:rPr>
       <w:i/>
       <w:iCs/>
-      <w:color w:themeColor="text1" w:themeTint="BF" w:val="404040"/>
-    </w:rPr>
-  </w:style>
-  <w:style w:customStyle="1" w:styleId="QuoteChar" w:type="character">
+      <w:color w:val="404040" w:themeColor="text1" w:themeTint="BF"/>
+    </w:rPr>
+  </w:style>
+  <w:style w:type="character" w:customStyle="1" w:styleId="QuoteChar">
     <w:name w:val="Quote Char"/>
     <w:basedOn w:val="DefaultParagraphFont"/>
     <w:link w:val="Quote"/>
@@ -1298,10 +1443,10 @@
     <w:rPr>
       <w:i/>
       <w:iCs/>
-      <w:color w:themeColor="text1" w:themeTint="BF" w:val="404040"/>
-    </w:rPr>
-  </w:style>
-  <w:style w:styleId="ListParagraph" w:type="paragraph">
+      <w:color w:val="404040" w:themeColor="text1" w:themeTint="BF"/>
+    </w:rPr>
+  </w:style>
+  <w:style w:type="paragraph" w:styleId="ListParagraph">
     <w:name w:val="List Paragraph"/>
     <w:basedOn w:val="Normal"/>
     <w:uiPriority w:val="34"/>
@@ -1312,7 +1457,7 @@
       <w:contextualSpacing/>
     </w:pPr>
   </w:style>
-  <w:style w:styleId="IntenseEmphasis" w:type="character">
+  <w:style w:type="character" w:styleId="IntenseEmphasis">
     <w:name w:val="Intense Emphasis"/>
     <w:basedOn w:val="DefaultParagraphFont"/>
     <w:uiPriority w:val="21"/>
@@ -1321,10 +1466,10 @@
     <w:rPr>
       <w:i/>
       <w:iCs/>
-      <w:color w:themeColor="accent1" w:themeShade="BF" w:val="0F4761"/>
-    </w:rPr>
-  </w:style>
-  <w:style w:styleId="IntenseQuote" w:type="paragraph">
+      <w:color w:val="0F4761" w:themeColor="accent1" w:themeShade="BF"/>
+    </w:rPr>
+  </w:style>
+  <w:style w:type="paragraph" w:styleId="IntenseQuote">
     <w:name w:val="Intense Quote"/>
     <w:basedOn w:val="Normal"/>
     <w:next w:val="Normal"/>
@@ -1334,20 +1479,20 @@
     <w:rsid w:val="008B663D"/>
     <w:pPr>
       <w:pBdr>
-        <w:top w:color="0F4761" w:space="10" w:sz="4" w:themeColor="accent1" w:themeShade="BF" w:val="single"/>
-        <w:bottom w:color="0F4761" w:space="10" w:sz="4" w:themeColor="accent1" w:themeShade="BF" w:val="single"/>
+        <w:top w:val="single" w:sz="4" w:space="10" w:color="0F4761" w:themeColor="accent1" w:themeShade="BF"/>
+        <w:bottom w:val="single" w:sz="4" w:space="10" w:color="0F4761" w:themeColor="accent1" w:themeShade="BF"/>
       </w:pBdr>
-      <w:spacing w:after="360" w:before="360"/>
+      <w:spacing w:before="360" w:after="360"/>
       <w:ind w:left="864" w:right="864"/>
       <w:jc w:val="center"/>
     </w:pPr>
     <w:rPr>
       <w:i/>
       <w:iCs/>
-      <w:color w:themeColor="accent1" w:themeShade="BF" w:val="0F4761"/>
-    </w:rPr>
-  </w:style>
-  <w:style w:customStyle="1" w:styleId="IntenseQuoteChar" w:type="character">
+      <w:color w:val="0F4761" w:themeColor="accent1" w:themeShade="BF"/>
+    </w:rPr>
+  </w:style>
+  <w:style w:type="character" w:customStyle="1" w:styleId="IntenseQuoteChar">
     <w:name w:val="Intense Quote Char"/>
     <w:basedOn w:val="DefaultParagraphFont"/>
     <w:link w:val="IntenseQuote"/>
@@ -1356,10 +1501,10 @@
     <w:rPr>
       <w:i/>
       <w:iCs/>
-      <w:color w:themeColor="accent1" w:themeShade="BF" w:val="0F4761"/>
-    </w:rPr>
-  </w:style>
-  <w:style w:styleId="IntenseReference" w:type="character">
+      <w:color w:val="0F4761" w:themeColor="accent1" w:themeShade="BF"/>
+    </w:rPr>
+  </w:style>
+  <w:style w:type="character" w:styleId="IntenseReference">
     <w:name w:val="Intense Reference"/>
     <w:basedOn w:val="DefaultParagraphFont"/>
     <w:uiPriority w:val="32"/>
@@ -1369,7 +1514,7 @@
       <w:b/>
       <w:bCs/>
       <w:smallCaps/>
-      <w:color w:themeColor="accent1" w:themeShade="BF" w:val="0F4761"/>
+      <w:color w:val="0F4761" w:themeColor="accent1" w:themeShade="BF"/>
       <w:spacing w:val="5"/>
     </w:rPr>
   </w:style>
@@ -1462,10 +1607,7 @@
   <w:style w:type="character" w:customStyle="1" w:styleId="ImportTok">
     <w:name w:val="ImportTok"/>
     <w:basedOn w:val="VerbatimChar"/>
-    <w:rPr>
-      <w:color w:val="008000"/>
-      <w:b/>
-    </w:rPr>
+    <w:rPr/>
   </w:style>
   <w:style w:type="character" w:customStyle="1" w:styleId="CommentTok">
     <w:name w:val="CommentTok"/>
@@ -1540,9 +1682,7 @@
   <w:style w:type="character" w:customStyle="1" w:styleId="BuiltInTok">
     <w:name w:val="BuiltInTok"/>
     <w:basedOn w:val="VerbatimChar"/>
-    <w:rPr>
-      <w:color w:val="008000"/>
-    </w:rPr>
+    <w:rPr/>
   </w:style>
   <w:style w:type="character" w:customStyle="1" w:styleId="ExtensionTok">
     <w:name w:val="ExtensionTok"/>

</xml_diff>

<commit_message>
docs: clarify family membership and optional birthday
</commit_message>
<xml_diff>
--- a/docs/brief/club-membership-brief.docx
+++ b/docs/brief/club-membership-brief.docx
@@ -425,6 +425,30 @@
       </w:pPr>
       <w:r>
         <w:t xml:space="preserve">A membership can be a family or an individual. The membership fee for a family is currently $40 and an individual membership is $20.</w:t>
+      </w:r>
+    </w:p>
+    <w:p>
+      <w:pPr>
+        <w:numPr>
+          <w:ilvl w:val="0"/>
+          <w:numId w:val="1004"/>
+        </w:numPr>
+        <w:pStyle w:val="Compact"/>
+      </w:pPr>
+      <w:r>
+        <w:t xml:space="preserve">A family membership is recorded as a single member record holding the primary contact’s information, regardless of how many people are in the family. The membership type (individual or family) is used only to determine the fee amount.</w:t>
+      </w:r>
+    </w:p>
+    <w:p>
+      <w:pPr>
+        <w:numPr>
+          <w:ilvl w:val="0"/>
+          <w:numId w:val="1004"/>
+        </w:numPr>
+        <w:pStyle w:val="Compact"/>
+      </w:pPr>
+      <w:r>
+        <w:t xml:space="preserve">Birthday is optional and collected as month and day only (no birth year); members provide it voluntarily.</w:t>
       </w:r>
     </w:p>
     <w:sectPr>

</xml_diff>